<commit_message>
Remove highlights and placeholders; finalize declarations and submission files
Co-Authored-By: Claude Sonnet 5.5 <noreply@anthropic.com>
Claude-Session: https://claude.ai/code/session_01Ac6H42VjpVF4dJt1z1jQbD
</commit_message>
<xml_diff>
--- a/dss_revision/submission/0_checklist.docx
+++ b/dss_revision/submission/0_checklist.docx
@@ -71,7 +71,7 @@
         <w:pStyle w:val="ListBullet"/>
       </w:pPr>
       <w:r>
-        <w:t>Complete the remaining highlighted fields: ORCID, postal address and telephone, CRediT roles, funding, conflicts, suggested reviewers (title page, cover letter)</w:t>
+        <w:t>Check the filled-in statements, which are based on standard wording and were not confirmed by you: no funding, no competing interests, sole-author approval and originality (title page, cover letter), and the CRediT role list. Add ORCID, postal address, telephone, and suggested reviewers if the system asks for them</w:t>
       </w:r>
     </w:p>
     <w:p>
@@ -87,7 +87,7 @@
         <w:pStyle w:val="ListBullet"/>
       </w:pPr>
       <w:r>
-        <w:t>Upload code_anonymous.zip to an anonymous host (for example, a private Zenodo or Figshare link, or an anonymization service for repositories) and insert the link in Section 4.1 and the Declarations. Do not use the current public repository link, which shows your account name</w:t>
+        <w:t>Upload code_anonymous.zip as a supplementary file in the submission system (the manuscript says it is provided as an anonymized supplementary archive). Do not link the current public GitHub repository, which shows your account name</w:t>
       </w:r>
     </w:p>
     <w:p>
@@ -95,7 +95,7 @@
         <w:pStyle w:val="ListBullet"/>
       </w:pPr>
       <w:r>
-        <w:t>Read each cited Decision Support Systems paper and adjust the one-line descriptions in Section 2.1 (written from titles and bibliographic records)</w:t>
+        <w:t>Read each cited Decision Support Systems paper and adjust the one-line descriptions in Section 2.1 (written from titles and bibliographic records); repeat the literature search in the journal for better-fitting papers</w:t>
       </w:r>
     </w:p>
     <w:p>
@@ -135,7 +135,7 @@
         <w:pStyle w:val="ListBullet"/>
       </w:pPr>
       <w:r>
-        <w:t>Reference style (the manuscript uses an Elsevier-like author-year style; a third-party page says numbered style; unverified)</w:t>
+        <w:t>Reference style (the manuscript uses an Elsevier-like author-year style and the author-year list was not checked against the journal; a third-party page says numbered style; unverified)</w:t>
       </w:r>
     </w:p>
     <w:p>

</xml_diff>